<commit_message>
phase2: template-robustness dataset (audit passed) and analysis; data schema; report builder
Alternate request template: delta-D null replicates; the cue effect on
clarification reverses sign (Ministral wording-dependent) and the utility
effect is not replicated.

Co-Authored-By: Claude Opus 5.5 <noreply@anthropic.com>
</commit_message>
<xml_diff>
--- a/manuscript/paper.docx
+++ b/manuscript/paper.docx
@@ -33,16 +33,7 @@
           <w:b w:val="0"/>
           <w:i w:val="0"/>
         </w:rPr>
-        <w:t>AI shopping agents increasingly stand between firms' product information and consumers' goals. Customer-centric evaluation should therefore ask both whether a recommendation is good and whether the agent represented the consumer's goal faithfully. We report a controlled audit with hypotheses and an analysis plan frozen before data collection, run in a synthetic laptop storefront. Forty controlled latent objectives were crossed with ambiguous versus explicit goal statements and four storefront conditions: neutral, scarcity, social proof and discount framing. Two model families acted as tool-using agents, Gemini 3.1 Flash-Lite and Ministral 14B. A fixed protocol required catalog inspection before an optional single clarification, answered by a deterministic simulated user, followed by structured preference weights and a ranking. A deterministic evaluator measured representation error D (half-L1 distance to the controlled objective), utility and regret. Of 1,920 planned runs, 1,881 were valid (98.0%); all failures are retained.</w:t>
-      </w:r>
-    </w:p>
-    <w:p>
-      <w:r>
-        <w:rPr>
-          <w:b w:val="0"/>
-          <w:i w:val="0"/>
-        </w:rPr>
-        <w:t>Goal ambiguity raised representation error (ambiguous minus explicit D = +0.095 (95% CI +0.069 to +0.119)). Under ambiguous goals, commercial cues did not change representation error (ΔD = -0.001 (95% CI -0.006 to +0.004)). They did lower the clarification rate (-0.054 (95% CI -0.070 to -0.039)) and slightly lowered recommendation utility (-0.006 (95% CI -0.010 to -0.003)); the 95% intervals come from a scenario-cluster bootstrap with 10,000 draws. The cue effects on clarification and utility were concentrated in one model family. Almost all clarification questions were multi-attribute trade-off questions that the protocol's simulated user could not answer, so asking rarely added information. The findings describe two model versions in a synthetic environment with simulated users and do not measure human consumer behaviour. They show that an agent's goal representation and its recommendation can respond differently to storefront framing, so the two should be audited separately.</w:t>
+        <w:t>AI shopping agents now stand between firms' product information and consumers' goals, so customer-centric evaluation must ask whether the agent represented the goal faithfully, not only whether its recommendation was good. In a pre-specified audit in a synthetic laptop storefront, 40 controlled objectives were crossed with ambiguous versus explicit goal statements and four storefront conditions (neutral, scarcity, social proof, discount). Gemini 3.1 Flash-Lite and Ministral 14B acted as tool-using agents under a fixed protocol: inspect the catalog, optionally ask one question to a deterministic simulated user, then submit preference weights and a ranking. Of 1,920 runs, 1,881 were valid. Goal ambiguity raised representation error D (ambiguous minus explicit: +0.095 (95% CI +0.069 to +0.119)). Under ambiguity, commercial cues left representation unchanged (ΔD = -0.001 (95% CI -0.006 to +0.004)), but lowered clarification (-0.054 (95% CI -0.070 to -0.039)) and slightly lowered utility (-0.006 (95% CI -0.010 to -0.003)), mainly for one model. Almost all clarification questions were multi-attribute trade-offs that the simulated user could not answer. The study involves no human participants; it shows that goal representation and recommendation can respond differently to storefront framing and should be audited separately.</w:t>
       </w:r>
     </w:p>
     <w:p>
@@ -81,7 +72,7 @@
           <w:b w:val="0"/>
           <w:i w:val="0"/>
         </w:rPr>
-        <w:t xml:space="preserve">Shopping is increasingly delegated. Conversational assistants and tool-using "agents" now search catalogs, ask follow-up questions and return ranked recommendations on a consumer's behalf. In this arrangement, the agent becomes an intermediary between the firm's product information and the consumer's goal. Customer-centric marketing has always asked whether the offer fits the customer. When an AI agent sits in the middle, a second question appears: does the intermediary </w:t>
+        <w:t xml:space="preserve">Shopping is increasingly delegated to conversational, tool-using agents that search catalogs, ask follow-up questions and rank products on a consumer's behalf, acting as intermediaries between firms' product information and consumers' goals. Customer-centric marketing has always asked whether the offer fits the customer. When an AI agent sits in the middle, a second question appears: does the intermediary </w:t>
       </w:r>
       <w:r>
         <w:rPr>
@@ -2201,100 +2192,7 @@
           <w:b w:val="0"/>
           <w:i w:val="0"/>
         </w:rPr>
-        <w:t>The data-quality audit (24 checks) passed. It checks:</w:t>
-      </w:r>
-    </w:p>
-    <w:p>
-      <w:pPr>
-        <w:pStyle w:val="ListBullet"/>
-      </w:pPr>
-      <w:r>
-        <w:rPr>
-          <w:b w:val="0"/>
-          <w:i w:val="0"/>
-        </w:rPr>
-        <w:t>factorial coverage and unique trial identifiers</w:t>
-      </w:r>
-    </w:p>
-    <w:p>
-      <w:pPr>
-        <w:pStyle w:val="ListBullet"/>
-      </w:pPr>
-      <w:r>
-        <w:rPr>
-          <w:b w:val="0"/>
-          <w:i w:val="0"/>
-        </w:rPr>
-        <w:t>frozen templates and configuration hashes</w:t>
-      </w:r>
-    </w:p>
-    <w:p>
-      <w:pPr>
-        <w:pStyle w:val="ListBullet"/>
-      </w:pPr>
-      <w:r>
-        <w:rPr>
-          <w:b w:val="0"/>
-          <w:i w:val="0"/>
-        </w:rPr>
-        <w:t>byte-identical catalog facts across arms, and correct cue placement</w:t>
-      </w:r>
-    </w:p>
-    <w:p>
-      <w:pPr>
-        <w:pStyle w:val="ListBullet"/>
-      </w:pPr>
-      <w:r>
-        <w:rPr>
-          <w:b w:val="0"/>
-          <w:i w:val="0"/>
-        </w:rPr>
-        <w:t>catalog inspection before any clarification</w:t>
-      </w:r>
-    </w:p>
-    <w:p>
-      <w:pPr>
-        <w:pStyle w:val="ListBullet"/>
-      </w:pPr>
-      <w:r>
-        <w:rPr>
-          <w:b w:val="0"/>
-          <w:i w:val="0"/>
-        </w:rPr>
-        <w:t>simulated-user determinism</w:t>
-      </w:r>
-    </w:p>
-    <w:p>
-      <w:pPr>
-        <w:pStyle w:val="ListBullet"/>
-      </w:pPr>
-      <w:r>
-        <w:rPr>
-          <w:b w:val="0"/>
-          <w:i w:val="0"/>
-        </w:rPr>
-        <w:t>separation of raw and evaluator-only data</w:t>
-      </w:r>
-    </w:p>
-    <w:p>
-      <w:pPr>
-        <w:pStyle w:val="ListBullet"/>
-      </w:pPr>
-      <w:r>
-        <w:rPr>
-          <w:b w:val="0"/>
-          <w:i w:val="0"/>
-        </w:rPr>
-        <w:t>independent recomputation of D, utility and regret from raw outputs</w:t>
-      </w:r>
-    </w:p>
-    <w:p>
-      <w:r>
-        <w:rPr>
-          <w:b w:val="0"/>
-          <w:i w:val="0"/>
-        </w:rPr>
-        <w:t>An automated scan of all 5,409 model-visible requests found no latent-objective, optimum, utility or arm-name leakage.</w:t>
+        <w:t>The data-quality audit (24 checks) passed. Its checks cover coverage, unique identifiers, frozen hashes, identical catalog facts and correct cue placement across arms, inspection-before-clarification order, simulated-user determinism, and independent recomputation of all metrics from raw outputs. An automated scan of all 5,409 model-visible requests found no latent-objective, optimum, utility or arm-name leakage.</w:t>
       </w:r>
     </w:p>
     <w:p>
@@ -2320,7 +2218,7 @@
           <w:b w:val="0"/>
           <w:i w:val="0"/>
         </w:rPr>
-        <w:t>The primary commercial-minus-neutral risk difference under ambiguity was -0.054 (95% CI -0.070 to -0.039); the interval excludes zero (Holm-adjusted p = 0.000). By model it was +0.000 (95% CI +0.000 to +0.000) for Gemini and -0.108 (95% CI -0.140 to -0.078) for Ministral. By cue it was -0.129 (95% CI -0.167 to -0.094) for scarcity, -0.029 (95% CI -0.058 to -0.004) for social proof and -0.004 (95% CI -0.013 to +0.000) for discount framing. Under explicit goals the commercial-minus-neutral difference was -0.110 (95% CI -0.207 to -0.010). The ambiguous-minus-explicit difference in clarification, averaged over arms, was +0.300 (95% CI +0.261 to +0.339).</w:t>
+        <w:t>The primary commercial-minus-neutral risk difference under ambiguity was -0.054 (95% CI -0.070 to -0.039); the interval excludes zero (Holm-adjusted p &lt; 0.001). By model it was +0.000 (95% CI +0.000 to +0.000) for Gemini and -0.108 (95% CI -0.140 to -0.078) for Ministral. By cue it was -0.129 (95% CI -0.167 to -0.094) for scarcity, -0.029 (95% CI -0.058 to -0.004) for social proof and -0.004 (95% CI -0.013 to +0.000) for discount framing. Under explicit goals the commercial-minus-neutral difference was -0.110 (95% CI -0.207 to -0.010). The ambiguous-minus-explicit difference in clarification, averaged over arms, was +0.300 (95% CI +0.261 to +0.339).</w:t>
       </w:r>
     </w:p>
     <w:p>
@@ -2329,7 +2227,7 @@
           <w:b w:val="0"/>
           <w:i w:val="0"/>
         </w:rPr>
-        <w:t>What the agents asked matters as much as whether they asked. Across all clarifications, the simulated user could give an informative answer only to single-dimension questions. That was 0.5% of Gemini's 776 clarifications and 1.9% of Ministral's 746. Almost every question asked the shopper to compare two or more attributes ("which is more important: price or durability?") or asked about an attribute outside the objective, such as battery life. Under the frozen answer function both kinds receive the standard uncertainty answer. Pairwise questions are reasonable in themselves; the low informative-answer rate is therefore a joint property of the agents' questioning style and the simulated user's frozen single-dimension design. Normalized question targets under ambiguity were: Gemini, unsupported or compound 99%; price 1%; Ministral, unsupported or compound 99%; durability 1%.</w:t>
+        <w:t>What the agents asked matters as much as whether they asked. Only single-dimension questions receive an informative answer from the simulated user: 0.5% of Gemini's 776 clarifications and 1.9% of Ministral's 746. Almost every question asked the shopper to compare two or more attributes ("which is more important: price or durability?") or asked about an attribute outside the objective, such as battery life. Under the frozen answer function both kinds receive the standard uncertainty answer. Pairwise questions are reasonable in themselves; the low informative-answer rate is therefore a joint property of the agents' questioning style and the simulated user's frozen single-dimension design. Normalized question targets under ambiguity were: Gemini, unsupported or compound 99%; price 1%; Ministral, unsupported or compound 99%; durability 1%.</w:t>
       </w:r>
     </w:p>
     <w:p>
@@ -2501,7 +2399,7 @@
           <w:b w:val="0"/>
           <w:i w:val="0"/>
         </w:rPr>
-        <w:t>Figure 5 shows utility and regret. Under ambiguity the primary commercial-minus-neutral contrasts were -0.006 (95% CI -0.010 to -0.003) for utility (the interval excludes zero; Holm-adjusted p = 0.001) and +0.006 (95% CI +0.003 to +0.010) for regret. By model, the utility contrast was -0.002 (95% CI -0.004 to -0.000) for Gemini and -0.011 (95% CI -0.018 to -0.004) for Ministral. By cue it was -0.005 (95% CI -0.007 to -0.002) for scarcity, -0.006 (95% CI -0.013 to +0.001) for social proof and -0.008 (95% CI -0.012 to -0.004) for discount framing. Under explicit goals the contrast was +0.005 (95% CI -0.000 to +0.010) pooled: -0.004 (95% CI -0.006 to -0.001) for Gemini and +0.013 (95% CI +0.004 to +0.022) for Ministral. These utility effects are small in absolute terms; the regret scale is shown in Figure 5.</w:t>
+        <w:t>Figure 5 shows utility and regret. Under ambiguity the primary commercial-minus-neutral contrasts were -0.006 (95% CI -0.010 to -0.003) for utility (the interval excludes zero; Holm-adjusted p &lt; 0.001) and +0.006 (95% CI +0.003 to +0.010) for regret. By model, the utility contrast was -0.002 (95% CI -0.004 to -0.000) for Gemini and -0.011 (95% CI -0.018 to -0.004) for Ministral. By cue it was -0.005 (95% CI -0.007 to -0.002) for scarcity, -0.006 (95% CI -0.013 to +0.001) for social proof and -0.008 (95% CI -0.012 to -0.004) for discount framing. Under explicit goals the contrast was +0.005 (95% CI -0.000 to +0.010) pooled: -0.004 (95% CI -0.006 to -0.001) for Gemini and +0.013 (95% CI +0.004 to +0.022) for Ministral. These utility effects are small in absolute terms; the regret scale is shown in Figure 5.</w:t>
       </w:r>
     </w:p>
     <w:p>
@@ -5032,7 +4930,7 @@
           <w:b w:val="0"/>
           <w:i w:val="0"/>
         </w:rPr>
-        <w:t>The cue-term detector is a fixed keyword list. Some neutral-arm runs match it through generic words, so commercial-minus-neutral differences, not raw counts, are the meaningful quantities. Figure 7 traces one case selected by a rule fixed in code: the most frequent behavioural category among ambiguous commercial runs, then the first trial by identifier.</w:t>
+        <w:t>The cue-term detector is a fixed keyword list with a non-zero neutral baseline, so commercial-minus-neutral differences are the meaningful quantities. Figure 7 traces one case selected by a rule fixed in code: the most frequent behavioural category among ambiguous commercial runs, then the first trial by identifier.</w:t>
       </w:r>
     </w:p>
     <w:p>
@@ -6034,7 +5932,7 @@
           <w:b w:val="0"/>
           <w:i w:val="0"/>
         </w:rPr>
-        <w:t xml:space="preserve"> For marketing, this pattern is a caution against evaluating AI intermediaries through any single lens. An audit of goal representation alone would have concluded that storefront framing is harmless here. An audit of final picks alone would have missed that framing also suppressed clarification for one agent. Customer-centric evaluation needs both views, plus the process view of whether and how the agent asks.</w:t>
+        <w:t xml:space="preserve"> For marketing, this pattern is a caution against evaluating AI intermediaries through any single lens. Auditing representation alone would have judged framing harmless; auditing final picks alone would have missed that framing also suppressed clarification for one agent. Customer-centric evaluation needs both views plus the process view.</w:t>
       </w:r>
     </w:p>
     <w:p>
@@ -6269,7 +6167,7 @@
           <w:b w:val="0"/>
           <w:i w:val="0"/>
         </w:rPr>
-        <w:t>The findings also distinguish the present cue-in-context channel from instruction-driven commercial influence through elicitation (Li, 2026) and principal assignment (Wadi &amp; Ma, 2026b). Here, no instruction favoured any product, yet one agent's choices still drifted toward cued listings. That is closer to the heuristic, storefront-architecture account of Wadi and Ma (2026a).</w:t>
+        <w:t>Unlike instruction-driven commercial influence (Li, 2026; Wadi &amp; Ma, 2026b), no instruction here favoured any product, yet one agent drifted toward cued listings, consistent with the storefront-architecture account of Wadi and Ma (2026a).</w:t>
       </w:r>
     </w:p>
     <w:p>

</xml_diff>

<commit_message>
phase4: detached finalizer; PDF bullet fix; robustness list formatting
Co-Authored-By: Claude Opus 5.5 <noreply@anthropic.com>
</commit_message>
<xml_diff>
--- a/manuscript/paper.docx
+++ b/manuscript/paper.docx
@@ -4378,19 +4378,21 @@
       </w:r>
     </w:p>
     <w:p>
+      <w:pPr>
+        <w:pStyle w:val="ListBullet"/>
+      </w:pPr>
       <w:r>
         <w:rPr>
           <w:b w:val="0"/>
           <w:i w:val="0"/>
         </w:rPr>
-        <w:t xml:space="preserve">1. </w:t>
       </w:r>
       <w:r>
         <w:rPr>
           <w:b/>
           <w:i w:val="0"/>
         </w:rPr>
-        <w:t>Repeat stability.</w:t>
+        <w:t>(1) Repeat stability.</w:t>
       </w:r>
       <w:r>
         <w:rPr>
@@ -4401,19 +4403,21 @@
       </w:r>
     </w:p>
     <w:p>
+      <w:pPr>
+        <w:pStyle w:val="ListBullet"/>
+      </w:pPr>
       <w:r>
         <w:rPr>
           <w:b w:val="0"/>
           <w:i w:val="0"/>
         </w:rPr>
-        <w:t xml:space="preserve">2. </w:t>
       </w:r>
       <w:r>
         <w:rPr>
           <w:b/>
           <w:i w:val="0"/>
         </w:rPr>
-        <w:t>Alternate request template</w:t>
+        <w:t>(2) Alternate request template</w:t>
       </w:r>
       <w:r>
         <w:rPr>
@@ -4424,19 +4428,21 @@
       </w:r>
     </w:p>
     <w:p>
+      <w:pPr>
+        <w:pStyle w:val="ListBullet"/>
+      </w:pPr>
       <w:r>
         <w:rPr>
           <w:b w:val="0"/>
           <w:i w:val="0"/>
         </w:rPr>
-        <w:t xml:space="preserve">3. </w:t>
       </w:r>
       <w:r>
         <w:rPr>
           <w:b/>
           <w:i w:val="0"/>
         </w:rPr>
-        <w:t>Permuted product order</w:t>
+        <w:t>(3) Permuted product order</w:t>
       </w:r>
       <w:r>
         <w:rPr>
@@ -4447,19 +4453,21 @@
       </w:r>
     </w:p>
     <w:p>
+      <w:pPr>
+        <w:pStyle w:val="ListBullet"/>
+      </w:pPr>
       <w:r>
         <w:rPr>
           <w:b w:val="0"/>
           <w:i w:val="0"/>
         </w:rPr>
-        <w:t xml:space="preserve">4–5. </w:t>
       </w:r>
       <w:r>
         <w:rPr>
           <w:b/>
           <w:i w:val="0"/>
         </w:rPr>
-        <w:t>Model-specific effects</w:t>
+        <w:t>(4–5) Model-specific effects</w:t>
       </w:r>
       <w:r>
         <w:rPr>
@@ -4484,19 +4492,21 @@
       </w:r>
     </w:p>
     <w:p>
+      <w:pPr>
+        <w:pStyle w:val="ListBullet"/>
+      </w:pPr>
       <w:r>
         <w:rPr>
           <w:b w:val="0"/>
           <w:i w:val="0"/>
         </w:rPr>
-        <w:t xml:space="preserve">6. </w:t>
       </w:r>
       <w:r>
         <w:rPr>
           <w:b/>
           <w:i w:val="0"/>
         </w:rPr>
-        <w:t>Relocated cue set</w:t>
+        <w:t>(6) Relocated cue set</w:t>
       </w:r>
       <w:r>
         <w:rPr>
@@ -4512,7 +4522,7 @@
           <w:b w:val="0"/>
           <w:i w:val="0"/>
         </w:rPr>
-        <w:t>Checks 2, 3 and 6 are separate datasets (ambiguous goal, 40 scenarios, all four storefront conditions, both models, one repetition) and are never pooled with the core.</w:t>
+        <w:t>Checks (2), (3) and (6) are separate datasets (ambiguous goal, 40 scenarios, all four storefront conditions, both models, one repetition) and are never pooled with the core.</w:t>
       </w:r>
     </w:p>
     <w:p>

</xml_diff>

<commit_message>
phase4: cue-location robustness complete; final figures, tables, manuscript, validation and submission package
Cue-location (audit passed): delta-D null; clarification and utility cue
effects replicate with a relocated cue set (Ministral). Final validation
all passed (85 tests, 0 recomputation mismatches, 0 leakage, 0 manuscript
token mismatches, no secrets). Manuscript 4,991 words.

Co-Authored-By: Claude Opus 5.5 <noreply@anthropic.com>
</commit_message>
<xml_diff>
--- a/manuscript/paper.docx
+++ b/manuscript/paper.docx
@@ -33,7 +33,7 @@
           <w:b w:val="0"/>
           <w:i w:val="0"/>
         </w:rPr>
-        <w:t>AI shopping agents now stand between firms' product information and consumers' goals, so customer-centric evaluation must ask whether the agent represented the goal faithfully, not only whether its recommendation was good. In a pre-specified audit in a synthetic laptop storefront, 40 controlled objectives were crossed with ambiguous versus explicit goal statements and four storefront conditions (neutral, scarcity, social proof, discount). Gemini 3.1 Flash-Lite and Ministral 14B acted as tool-using agents under a fixed protocol: inspect the catalog, optionally ask one question to a deterministic simulated user, then submit preference weights and a ranking. Of 1,920 runs, 1,881 were valid. Goal ambiguity raised representation error D (ambiguous minus explicit: +0.095 (95% CI +0.069 to +0.119)). Under ambiguity, commercial cues left representation unchanged (ΔD = -0.001 (95% CI -0.006 to +0.004)), but lowered clarification (-0.054 (95% CI -0.070 to -0.039)) and slightly lowered utility (-0.006 (95% CI -0.010 to -0.003)), mainly for one model; these two cue effects did not replicate under an alternate request wording or a permuted product order, whereas the null representation shift did. Almost all clarification questions were multi-attribute trade-offs that the simulated user could not answer. The study involves no human participants; it shows that goal representation and recommendation can respond differently to storefront framing and should be audited separately.</w:t>
+        <w:t>AI shopping agents now stand between firms' product information and consumers' goals, so customer-centric evaluation must ask whether the agent represented the goal faithfully, not only whether its recommendation was good. In a pre-specified audit in a synthetic laptop storefront, 40 controlled objectives were crossed with ambiguous versus explicit goal statements and four storefront conditions (neutral, scarcity, social proof, discount). Gemini 3.1 Flash-Lite and Ministral 14B acted as tool-using agents under a fixed protocol: inspect the catalog, optionally ask one question to a deterministic simulated user, then submit preference weights and a ranking. Of 1,920 runs, 1,881 were valid. Goal ambiguity raised representation error D (ambiguous minus explicit: +0.095 (95% CI +0.069 to +0.119)). Under ambiguity, commercial cues left representation unchanged (ΔD = -0.001 (95% CI -0.006 to +0.004)), but lowered clarification (-0.054 (95% CI -0.070 to -0.039)) and slightly lowered utility (-0.006 (95% CI -0.010 to -0.003)), mainly for one model. These two cue effects replicated when the labels were moved to a different product set but not under an alternate request wording or a permuted product order; the null representation shift replicated in all three checks. Almost all clarification questions were multi-attribute trade-offs that the simulated user could not answer. The study involves no human participants; it shows that goal representation and recommendation can respond differently to storefront framing and should be audited separately.</w:t>
       </w:r>
     </w:p>
     <w:p>
@@ -4513,7 +4513,7 @@
           <w:b w:val="0"/>
           <w:i w:val="0"/>
         </w:rPr>
-        <w:t>, where labels were placed on a different, independently drawn set of five products (not run): ΔD = not run; clarification difference not run; utility difference not run.</w:t>
+        <w:t>, where labels were placed on a different, independently drawn set of five products (315 of 320 runs valid; audit passed): ΔD = -0.000 (95% CI -0.009 to +0.008); clarification difference -0.043 (95% CI -0.067 to -0.019); utility difference -0.008 (95% CI -0.012 to -0.004).</w:t>
       </w:r>
     </w:p>
     <w:p>
@@ -5161,12 +5161,228 @@
           </w:p>
         </w:tc>
       </w:tr>
+      <w:tr>
+        <w:tc>
+          <w:tcPr>
+            <w:tcW w:type="dxa" w:w="2160"/>
+          </w:tcPr>
+          <w:p>
+            <w:r>
+              <w:rPr>
+                <w:sz w:val="16"/>
+              </w:rPr>
+              <w:t>Robust: cue location</w:t>
+            </w:r>
+          </w:p>
+        </w:tc>
+        <w:tc>
+          <w:tcPr>
+            <w:tcW w:type="dxa" w:w="2160"/>
+          </w:tcPr>
+          <w:p>
+            <w:r>
+              <w:rPr>
+                <w:sz w:val="16"/>
+              </w:rPr>
+              <w:t>Clarification rate</w:t>
+            </w:r>
+          </w:p>
+        </w:tc>
+        <w:tc>
+          <w:tcPr>
+            <w:tcW w:type="dxa" w:w="2160"/>
+          </w:tcPr>
+          <w:p>
+            <w:r>
+              <w:rPr>
+                <w:sz w:val="16"/>
+              </w:rPr>
+              <w:t>-0.043 [-0.067, -0.019]</w:t>
+            </w:r>
+          </w:p>
+        </w:tc>
+        <w:tc>
+          <w:tcPr>
+            <w:tcW w:type="dxa" w:w="2160"/>
+          </w:tcPr>
+          <w:p>
+            <w:r>
+              <w:rPr>
+                <w:sz w:val="16"/>
+              </w:rPr>
+              <w:t>315/320 valid</w:t>
+            </w:r>
+          </w:p>
+        </w:tc>
+      </w:tr>
+      <w:tr>
+        <w:tc>
+          <w:tcPr>
+            <w:tcW w:type="dxa" w:w="2160"/>
+          </w:tcPr>
+          <w:p>
+            <w:r>
+              <w:rPr>
+                <w:sz w:val="16"/>
+              </w:rPr>
+              <w:t>Robust: cue location</w:t>
+            </w:r>
+          </w:p>
+        </w:tc>
+        <w:tc>
+          <w:tcPr>
+            <w:tcW w:type="dxa" w:w="2160"/>
+          </w:tcPr>
+          <w:p>
+            <w:r>
+              <w:rPr>
+                <w:sz w:val="16"/>
+              </w:rPr>
+              <w:t>Representation error D</w:t>
+            </w:r>
+          </w:p>
+        </w:tc>
+        <w:tc>
+          <w:tcPr>
+            <w:tcW w:type="dxa" w:w="2160"/>
+          </w:tcPr>
+          <w:p>
+            <w:r>
+              <w:rPr>
+                <w:sz w:val="16"/>
+              </w:rPr>
+              <w:t>-0.000 [-0.009, 0.008]</w:t>
+            </w:r>
+          </w:p>
+        </w:tc>
+        <w:tc>
+          <w:tcPr>
+            <w:tcW w:type="dxa" w:w="2160"/>
+          </w:tcPr>
+          <w:p>
+            <w:r>
+              <w:rPr>
+                <w:sz w:val="16"/>
+              </w:rPr>
+              <w:t>315/320 valid</w:t>
+            </w:r>
+          </w:p>
+        </w:tc>
+      </w:tr>
+      <w:tr>
+        <w:tc>
+          <w:tcPr>
+            <w:tcW w:type="dxa" w:w="2160"/>
+          </w:tcPr>
+          <w:p>
+            <w:r>
+              <w:rPr>
+                <w:sz w:val="16"/>
+              </w:rPr>
+              <w:t>Robust: cue location</w:t>
+            </w:r>
+          </w:p>
+        </w:tc>
+        <w:tc>
+          <w:tcPr>
+            <w:tcW w:type="dxa" w:w="2160"/>
+          </w:tcPr>
+          <w:p>
+            <w:r>
+              <w:rPr>
+                <w:sz w:val="16"/>
+              </w:rPr>
+              <w:t>Recommendation utility</w:t>
+            </w:r>
+          </w:p>
+        </w:tc>
+        <w:tc>
+          <w:tcPr>
+            <w:tcW w:type="dxa" w:w="2160"/>
+          </w:tcPr>
+          <w:p>
+            <w:r>
+              <w:rPr>
+                <w:sz w:val="16"/>
+              </w:rPr>
+              <w:t>-0.008 [-0.012, -0.004]</w:t>
+            </w:r>
+          </w:p>
+        </w:tc>
+        <w:tc>
+          <w:tcPr>
+            <w:tcW w:type="dxa" w:w="2160"/>
+          </w:tcPr>
+          <w:p>
+            <w:r>
+              <w:rPr>
+                <w:sz w:val="16"/>
+              </w:rPr>
+              <w:t>315/320 valid</w:t>
+            </w:r>
+          </w:p>
+        </w:tc>
+      </w:tr>
+      <w:tr>
+        <w:tc>
+          <w:tcPr>
+            <w:tcW w:type="dxa" w:w="2160"/>
+          </w:tcPr>
+          <w:p>
+            <w:r>
+              <w:rPr>
+                <w:sz w:val="16"/>
+              </w:rPr>
+              <w:t>Robust: cue location</w:t>
+            </w:r>
+          </w:p>
+        </w:tc>
+        <w:tc>
+          <w:tcPr>
+            <w:tcW w:type="dxa" w:w="2160"/>
+          </w:tcPr>
+          <w:p>
+            <w:r>
+              <w:rPr>
+                <w:sz w:val="16"/>
+              </w:rPr>
+              <w:t>Regret</w:t>
+            </w:r>
+          </w:p>
+        </w:tc>
+        <w:tc>
+          <w:tcPr>
+            <w:tcW w:type="dxa" w:w="2160"/>
+          </w:tcPr>
+          <w:p>
+            <w:r>
+              <w:rPr>
+                <w:sz w:val="16"/>
+              </w:rPr>
+              <w:t>0.008 [0.004, 0.012]</w:t>
+            </w:r>
+          </w:p>
+        </w:tc>
+        <w:tc>
+          <w:tcPr>
+            <w:tcW w:type="dxa" w:w="2160"/>
+          </w:tcPr>
+          <w:p>
+            <w:r>
+              <w:rPr>
+                <w:sz w:val="16"/>
+              </w:rPr>
+              <w:t>315/320 valid</w:t>
+            </w:r>
+          </w:p>
+        </w:tc>
+      </w:tr>
     </w:tbl>
     <w:p>
       <w:r>
         <w:drawing>
           <wp:inline xmlns:a="http://schemas.openxmlformats.org/drawingml/2006/main" xmlns:pic="http://schemas.openxmlformats.org/drawingml/2006/picture">
-            <wp:extent cx="5760720" cy="3329381"/>
+            <wp:extent cx="5760720" cy="3836672"/>
             <wp:docPr id="7" name="Picture 7"/>
             <wp:cNvGraphicFramePr>
               <a:graphicFrameLocks noChangeAspect="1"/>
@@ -5187,7 +5403,7 @@
                   <pic:spPr>
                     <a:xfrm>
                       <a:off x="0" y="0"/>
-                      <a:ext cx="5760720" cy="3329381"/>
+                      <a:ext cx="5760720" cy="3836672"/>
                     </a:xfrm>
                     <a:prstGeom prst="rect"/>
                   </pic:spPr>
@@ -6343,7 +6559,7 @@
           <w:b w:val="0"/>
           <w:i w:val="0"/>
         </w:rPr>
-        <w:t xml:space="preserve"> Under the controlled environment, the explicitness of the goal statement mattered far more for representation fidelity than storefront framing did. Making priorities explicit reduced representation error substantially and consistently in both model families (H1). Ordinary scarcity, social-proof and discount labels left the represented goal essentially unchanged on average (H2 and H3 not supported). The cues nonetheless changed behaviour around the representation. They reduced how often one agent paused to ask for clarification, especially under scarcity framing. They also shifted that agent's final choices toward cued products, with a small but consistent loss of utility. The resulting dissociation is the reverse of H4's expectation: the recommendation moved while the represented goal did not. The robustness datasets qualify this picture. The null representation shift replicated under an alternate request wording and a permuted product order. The cue effects on clarification and utility did not: with the alternate wording the clarification effect reversed sign (+0.203 (95% CI +0.104 to +0.292)), and with permuted order both effects were indistinguishable from zero. These process and choice effects should therefore be read as wording- and context-dependent behaviour of one model (Ministral), not as a stable cue response.</w:t>
+        <w:t xml:space="preserve"> Under the controlled environment, the explicitness of the goal statement mattered far more for representation fidelity than storefront framing did. Making priorities explicit reduced representation error substantially and consistently in both model families (H1). Ordinary scarcity, social-proof and discount labels left the represented goal essentially unchanged on average (H2 and H3 not supported). The cues nonetheless changed behaviour around the representation. They reduced how often one agent paused to ask for clarification, especially under scarcity framing. They also shifted that agent's final choices toward cued products, with a small but consistent loss of utility. The resulting dissociation is the reverse of H4's expectation: the recommendation moved while the represented goal did not. The robustness datasets qualify this picture. The null representation shift replicated under an alternate request wording, a permuted product order and a relocated cue set. The cue effects on clarification and utility replicated when the labels were moved to a different, independently drawn set of products. Ministral's share of cued top products rose by +0.505 (95% CI +0.419 to +0.571), so its choices follow whichever products carry a cue. These effects did not replicate under other presentations. With the alternate wording the clarification effect reversed sign (+0.203 (95% CI +0.104 to +0.292)), and with permuted order both effects were indistinguishable from zero. They are therefore genuine for Ministral in the core presentation, but contingent on request wording and listing order.</w:t>
       </w:r>
     </w:p>
     <w:p>
@@ -6374,7 +6590,7 @@
           <w:b w:val="0"/>
           <w:i w:val="0"/>
         </w:rPr>
-        <w:t>The clarification results add a second lesson. Both agents typically asked pairwise or multi-attribute trade-off questions. Gemini asked, for example, "which is more important to you: keeping the price as low as possible, or prioritizing higher durability for long-term use throughout college?" Ministral often asked about battery life, which is not part of the controlled objective. Under the frozen protocol, the simulated shopper answers only single-dimension questions, so it could not use these. Asking was common, but informative asking was rare. In deployed settings, whether a clarifying question helps depends on whether it is one the customer can actually answer. The frequency of questions is not a measure of customer-centricity.</w:t>
+        <w:t>The clarification results add a second lesson. Both agents typically asked pairwise or multi-attribute trade-off questions. Gemini asked, for example, "which is more important to you: keeping the price as low as possible, or prioritizing higher durability for long-term use throughout college?" Ministral often asked about battery life, which is not part of the controlled objective. Under the frozen protocol, the simulated shopper answers only single-dimension questions, so it could not use these. Asking was common but informative asking rare; question frequency is not a measure of customer-centricity.</w:t>
       </w:r>
     </w:p>
     <w:p>
@@ -6383,7 +6599,7 @@
           <w:b w:val="0"/>
           <w:i w:val="0"/>
         </w:rPr>
-        <w:t>Finally, the two model families behaved differently. Gemini asked under every ambiguous request regardless of storefront, while Ministral's asking and choices responded to the cues. "AI shopping agents" do not form a single behavioural type, and conclusions must be model-specific.</w:t>
+        <w:t>Finally, Gemini asked under every ambiguous request regardless of storefront, while Ministral's asking and choices responded to cues: conclusions must be model-specific.</w:t>
       </w:r>
     </w:p>
     <w:p>
@@ -6784,7 +7000,7 @@
           <w:b w:val="0"/>
           <w:i w:val="0"/>
         </w:rPr>
-        <w:t>Before an AI shopping agent recommends anything, it forms a picture of what the customer wants. This audit measured that picture against a known objective. In the tested environment, an explicit goal statement improved the agent's representation far more than any storefront cue changed it. Ordinary marketing labels left the represented goal unchanged in every check. In the core design they changed whether one agent asked for clarification and which product it chose, but these process effects were sensitive to request wording and product order. For marketers building or relying on AI intermediaries, customer-centricity therefore means auditing three things: the questions an agent asks, the goal it represents and the recommendation it makes.</w:t>
+        <w:t>Before an AI shopping agent recommends anything, it forms a picture of what the customer wants. This audit measured that picture against a known objective. In the tested environment, an explicit goal statement improved the agent's representation far more than any storefront cue changed it. Ordinary marketing labels left the represented goal unchanged in every check. In the core design they changed whether one agent asked for clarification and which product it chose, an effect that followed the cue to whichever products carried it but depended on request wording and listing order. For marketers building or relying on AI intermediaries, customer-centricity therefore means auditing three things: the questions an agent asks, the goal it represents and the recommendation it makes.</w:t>
       </w:r>
     </w:p>
     <w:p>

</xml_diff>

<commit_message>
phase4: IEEE LaTeX package (compiled), literature survey, final manuscript and submission package
paper/ieee: IEEEtran conference source generated from the token-rendered
manuscript, verified BibTeX (16 works), final figures and CSV-generated
tables; pdfLaTeX build has 0 errors, 0 undefined refs, 0 overfull boxes.
Final validation all passed; manuscript 4,990 words.

Co-Authored-By: Claude Opus 5.5 <noreply@anthropic.com>
</commit_message>
<xml_diff>
--- a/manuscript/paper.docx
+++ b/manuscript/paper.docx
@@ -2422,7 +2422,7 @@
           <w:b w:val="0"/>
           <w:i w:val="0"/>
         </w:rPr>
-        <w:t xml:space="preserve"> Figure 8 plots each matched pair's ΔD against its utility change.</w:t>
+        <w:t xml:space="preserve"> Figure 6 plots each matched pair's ΔD against its utility change.</w:t>
       </w:r>
     </w:p>
     <w:p>
@@ -4322,7 +4322,7 @@
         <w:rPr>
           <w:i/>
         </w:rPr>
-        <w:t>Figure 8. Representation shift versus utility change in matched pairs (ambiguous goal).</w:t>
+        <w:t>Figure 6. Representation shift versus utility change in matched pairs (ambiguous goal).</w:t>
       </w:r>
     </w:p>
     <w:p>
@@ -5419,7 +5419,7 @@
         <w:rPr>
           <w:i/>
         </w:rPr>
-        <w:t>Figure 6. Primary contrasts by model and robustness dataset (95% scenario-bootstrap intervals).</w:t>
+        <w:t>Figure 7. Primary contrasts by model and robustness dataset (95% scenario-bootstrap intervals).</w:t>
       </w:r>
     </w:p>
     <w:p>
@@ -5486,7 +5486,7 @@
           <w:b w:val="0"/>
           <w:i w:val="0"/>
         </w:rPr>
-        <w:t xml:space="preserve"> are model-behaviour or protocol outcomes. Gemini had none (none). Ministral's were clarification order violation (1), interface contract violation (35), schema validation failure (3). Most were plain-text answers without the required tool call. None was a provider failure, so none was eligible for the frozen technical re-run.</w:t>
+        <w:t xml:space="preserve"> are model-behaviour or protocol outcomes. Gemini had 0. Ministral's were clarification order violation (1), interface contract violation (35), schema validation failure (3). Most were plain-text answers without the required tool call. None was a provider failure, so none was eligible for the frozen technical re-run.</w:t>
       </w:r>
     </w:p>
     <w:p>
@@ -5579,7 +5579,7 @@
           <w:b w:val="0"/>
           <w:i w:val="0"/>
         </w:rPr>
-        <w:t>The cue-term detector is a fixed keyword list with a non-zero neutral baseline, so commercial-minus-neutral differences are the meaningful quantities. Figure 7 traces one case selected by a rule fixed in code: the most frequent behavioural category among ambiguous commercial runs, then the first trial by identifier.</w:t>
+        <w:t>The cue-term detector is a fixed keyword list with a non-zero neutral baseline, so commercial-minus-neutral differences are the meaningful quantities. Figure 8 traces one case selected by a rule fixed in code: the most frequent behavioural category among ambiguous commercial runs, then the first trial by identifier.</w:t>
       </w:r>
     </w:p>
     <w:p>
@@ -6529,7 +6529,7 @@
         <w:rPr>
           <w:i/>
         </w:rPr>
-        <w:t>Figure 7. Representative failure pathway (selected by a pre-specified rule).</w:t>
+        <w:t>Figure 8. Representative failure pathway (selected by a pre-specified rule).</w:t>
       </w:r>
     </w:p>
     <w:p>

</xml_diff>